<commit_message>
locked in this model
</commit_message>
<xml_diff>
--- a/docs/CHAIN1_LOGIC.docx
+++ b/docs/CHAIN1_LOGIC.docx
@@ -4066,6 +4066,92 @@
       </w:pPr>
       <w:r>
         <w:t xml:space="preserve">Stops ÷ 12 (red van) and ÷ 8 (truck) therefore gives about 2× too many red vans and 2.4× too few trucks.</w:t>
+      </w:r>
+    </w:p>
+    <w:p>
+      <w:pPr>
+        <w:pStyle w:val="ListParagraph"/>
+        <w:numPr>
+          <w:ilvl w:val="0"/>
+          <w:numId w:val="2"/>
+        </w:numPr>
+      </w:pPr>
+      <w:r>
+        <w:rPr>
+          <w:b/>
+          <w:bCs/>
+        </w:rPr>
+        <w:t xml:space="preserve">One number per vehicle type: red van 19 stops, truck 3.4 stops.</w:t>
+      </w:r>
+    </w:p>
+    <w:p>
+      <w:pPr>
+        <w:pStyle w:val="ListParagraph"/>
+        <w:numPr>
+          <w:ilvl w:val="1"/>
+          <w:numId w:val="2"/>
+        </w:numPr>
+      </w:pPr>
+      <w:r>
+        <w:t xml:space="preserve">It is the </w:t>
+      </w:r>
+      <w:r>
+        <w:rPr>
+          <w:b/>
+          <w:bCs/>
+        </w:rPr>
+        <w:t xml:space="preserve">mean</w:t>
+      </w:r>
+      <w:r>
+        <w:t xml:space="preserve"> over every route on every day, Mon–Fri: total stops ÷ total route-days. Red van 18.7 over 2,092 route-days; truck 3.4 over 866.</w:t>
+      </w:r>
+    </w:p>
+    <w:p>
+      <w:pPr>
+        <w:pStyle w:val="ListParagraph"/>
+        <w:numPr>
+          <w:ilvl w:val="1"/>
+          <w:numId w:val="2"/>
+        </w:numPr>
+      </w:pPr>
+      <w:r>
+        <w:t xml:space="preserve">Use the mean, not the median (red van 17, truck 3). Fleet = stops ÷ stops-per-vehicle only gives back the measured route count when the divisor is the mean, because the long routes carry a large share of the stops. The median over-counts the fleet.</w:t>
+      </w:r>
+    </w:p>
+    <w:p>
+      <w:pPr>
+        <w:pStyle w:val="ListParagraph"/>
+        <w:numPr>
+          <w:ilvl w:val="1"/>
+          <w:numId w:val="2"/>
+        </w:numPr>
+      </w:pPr>
+      <w:r>
+        <w:t xml:space="preserve">Check: 7,821 ÷ 19 = 412 red vans against 418 measured; 584 ÷ 3.4 = 172 trucks against 173 measured.</w:t>
+      </w:r>
+    </w:p>
+    <w:p>
+      <w:pPr>
+        <w:pStyle w:val="ListParagraph"/>
+        <w:numPr>
+          <w:ilvl w:val="1"/>
+          <w:numId w:val="2"/>
+        </w:numPr>
+      </w:pPr>
+      <w:r>
+        <w:t xml:space="preserve">If a whole number is required for trucks, use 3. It over-counts by about 12% (195 trucks), the conservative side for sizing.</w:t>
+      </w:r>
+    </w:p>
+    <w:p>
+      <w:pPr>
+        <w:pStyle w:val="ListParagraph"/>
+        <w:numPr>
+          <w:ilvl w:val="1"/>
+          <w:numId w:val="2"/>
+        </w:numPr>
+      </w:pPr>
+      <w:r>
+        <w:t xml:space="preserve">It hides the site spread: red-van sites range from 15.4 (Sunshine West) to 22.9 (Dandenong South) stops per route. One number over-sizes Dandenong South and Oakleigh South by about 20% and under-sizes Sunshine West by about 20%. The two trucks agree (3.3 and 3.4).</w:t>
       </w:r>
     </w:p>
     <w:p>

</xml_diff>

<commit_message>
update pickup point counts for multi rounds
</commit_message>
<xml_diff>
--- a/docs/CHAIN1_LOGIC.docx
+++ b/docs/CHAIN1_LOGIC.docx
@@ -792,7 +792,7 @@
         </w:numPr>
       </w:pPr>
       <w:r>
-        <w:t xml:space="preserve">Run </w:t>
+        <w:t xml:space="preserve">Run the RCB routing (OSRM road distances). Current run: </w:t>
       </w:r>
       <w:r>
         <w:rPr>
@@ -800,10 +800,10 @@
           <w:sz w:val="20"/>
           <w:szCs w:val="20"/>
         </w:rPr>
-        <w:t xml:space="preserve">first_mile_pickup_v4</w:t>
-      </w:r>
-      <w:r>
-        <w:t xml:space="preserve"> (OSRM road distances).</w:t>
+        <w:t xml:space="preserve">pickup_new_version_2</w:t>
+      </w:r>
+      <w:r>
+        <w:t xml:space="preserve">, 2026-09-29.</w:t>
       </w:r>
     </w:p>
     <w:p>
@@ -827,7 +827,7 @@
         </w:numPr>
       </w:pPr>
       <w:r>
-        <w:t xml:space="preserve">red_van: 200 parcels, target 25 stops;</w:t>
+        <w:t xml:space="preserve">red_van: 200 parcels, target 19 stops;</w:t>
       </w:r>
     </w:p>
     <w:p>
@@ -839,7 +839,7 @@
         </w:numPr>
       </w:pPr>
       <w:r>
-        <w:t xml:space="preserve">white_van: 180 parcels, target 10 stops.</w:t>
+        <w:t xml:space="preserve">white_van: 180 parcels, target 3 stops.</w:t>
       </w:r>
     </w:p>
     <w:p>
@@ -953,7 +953,7 @@
           <w:b/>
           <w:bCs/>
         </w:rPr>
-        <w:t xml:space="preserve">)</w:t>
+        <w:t xml:space="preserve">) — the only collection basis</w:t>
       </w:r>
     </w:p>
     <w:p>
@@ -992,7 +992,7 @@
           <w:b/>
           <w:bCs/>
         </w:rPr>
-        <w:t xml:space="preserve">402 cells:</w:t>
+        <w:t xml:space="preserve">663 cells:</w:t>
       </w:r>
     </w:p>
     <w:p>
@@ -1004,7 +1004,7 @@
         </w:numPr>
       </w:pPr>
       <w:r>
-        <w:t xml:space="preserve">Oakleigh South 100</w:t>
+        <w:t xml:space="preserve">Oakleigh South 135</w:t>
       </w:r>
     </w:p>
     <w:p>
@@ -1016,7 +1016,7 @@
         </w:numPr>
       </w:pPr>
       <w:r>
-        <w:t xml:space="preserve">Sunshine West 81</w:t>
+        <w:t xml:space="preserve">Melbourne Transport 126</w:t>
       </w:r>
     </w:p>
     <w:p>
@@ -1028,7 +1028,7 @@
         </w:numPr>
       </w:pPr>
       <w:r>
-        <w:t xml:space="preserve">Bayswater 68</w:t>
+        <w:t xml:space="preserve">Sunshine West 112</w:t>
       </w:r>
     </w:p>
     <w:p>
@@ -1040,7 +1040,7 @@
         </w:numPr>
       </w:pPr>
       <w:r>
-        <w:t xml:space="preserve">Melbourne North 49</w:t>
+        <w:t xml:space="preserve">Bayswater 92</w:t>
       </w:r>
     </w:p>
     <w:p>
@@ -1052,7 +1052,7 @@
         </w:numPr>
       </w:pPr>
       <w:r>
-        <w:t xml:space="preserve">Dandenong South 44</w:t>
+        <w:t xml:space="preserve">Dandenong Transport 72</w:t>
       </w:r>
     </w:p>
     <w:p>
@@ -1064,7 +1064,7 @@
         </w:numPr>
       </w:pPr>
       <w:r>
-        <w:t xml:space="preserve">Melbourne Transport 38</w:t>
+        <w:t xml:space="preserve">Melbourne North 66</w:t>
       </w:r>
     </w:p>
     <w:p>
@@ -1076,7 +1076,7 @@
         </w:numPr>
       </w:pPr>
       <w:r>
-        <w:t xml:space="preserve">Dandenong Transport 22</w:t>
+        <w:t xml:space="preserve">Dandenong South 60</w:t>
       </w:r>
     </w:p>
     <w:p>
@@ -1110,7 +1110,7 @@
         </w:numPr>
       </w:pPr>
       <w:r>
-        <w:t xml:space="preserve">Leg-1 distance is the haversine distance from cluster centroid to collecting site. The mean is 16.0 km, against 22.1 km on postcode centroids.</w:t>
+        <w:t xml:space="preserve">Leg-1 distance is the haversine distance from cluster centroid to collecting site. The mean is 11.6 km.</w:t>
       </w:r>
     </w:p>
     <w:p>
@@ -1125,182 +1125,7 @@
         <w:pStyle w:val="Heading1"/>
       </w:pPr>
       <w:r>
-        <w:t xml:space="preserve">5. Alternative basis, built but not switched on</w:t>
-      </w:r>
-    </w:p>
-    <w:p>
-      <w:pPr>
-        <w:spacing w:after="60" w:before="120"/>
-      </w:pPr>
-      <w:r>
-        <w:rPr>
-          <w:b/>
-          <w:bCs/>
-        </w:rPr>
-        <w:t xml:space="preserve">Postcode weights (</w:t>
-      </w:r>
-      <w:r>
-        <w:rPr>
-          <w:rFonts w:ascii="Consolas" w:cs="Consolas" w:eastAsia="Consolas" w:hAnsi="Consolas"/>
-          <w:b/>
-          <w:bCs/>
-          <w:sz w:val="20"/>
-          <w:szCs w:val="20"/>
-        </w:rPr>
-        <w:t xml:space="preserve">PICKUP_WEIGHTS</w:t>
-      </w:r>
-      <w:r>
-        <w:rPr>
-          <w:b/>
-          <w:bCs/>
-        </w:rPr>
-        <w:t xml:space="preserve">, </w:t>
-      </w:r>
-      <w:r>
-        <w:rPr>
-          <w:rFonts w:ascii="Consolas" w:cs="Consolas" w:eastAsia="Consolas" w:hAnsi="Consolas"/>
-          <w:b/>
-          <w:bCs/>
-          <w:sz w:val="20"/>
-          <w:szCs w:val="20"/>
-        </w:rPr>
-        <w:t xml:space="preserve">utilities/catchment_visit_weights.py</w:t>
-      </w:r>
-      <w:r>
-        <w:rPr>
-          <w:b/>
-          <w:bCs/>
-        </w:rPr>
-        <w:t xml:space="preserve">)</w:t>
-      </w:r>
-    </w:p>
-    <w:p>
-      <w:pPr>
-        <w:pStyle w:val="ListParagraph"/>
-        <w:numPr>
-          <w:ilvl w:val="0"/>
-          <w:numId w:val="2"/>
-        </w:numPr>
-      </w:pPr>
-      <w:r>
-        <w:t xml:space="preserve">Share of stop-events per (site, postcode) over the week, using the same filter rules as section 3.</w:t>
-      </w:r>
-    </w:p>
-    <w:p>
-      <w:pPr>
-        <w:pStyle w:val="ListParagraph"/>
-        <w:numPr>
-          <w:ilvl w:val="0"/>
-          <w:numId w:val="2"/>
-        </w:numPr>
-      </w:pPr>
-      <w:r>
-        <w:t xml:space="preserve">Stop-events are the best predictor of collected volume where CCP records it: r = 0.998 at Dandenong Transport and 0.988 at Melbourne Transport.</w:t>
-      </w:r>
-    </w:p>
-    <w:p>
-      <w:pPr>
-        <w:pStyle w:val="ListParagraph"/>
-        <w:numPr>
-          <w:ilvl w:val="0"/>
-          <w:numId w:val="2"/>
-        </w:numPr>
-      </w:pPr>
-      <w:r>
-        <w:t xml:space="preserve">The weights replace the equal split across a site's </w:t>
-      </w:r>
-      <w:r>
-        <w:rPr>
-          <w:b/>
-          <w:bCs/>
-        </w:rPr>
-        <w:t xml:space="preserve">postcodes</w:t>
-      </w:r>
-      <w:r>
-        <w:t xml:space="preserve">.</w:t>
-      </w:r>
-    </w:p>
-    <w:p>
-      <w:pPr>
-        <w:pStyle w:val="ListParagraph"/>
-        <w:numPr>
-          <w:ilvl w:val="0"/>
-          <w:numId w:val="2"/>
-        </w:numPr>
-      </w:pPr>
-      <w:r>
-        <w:t xml:space="preserve">This is shape only: the site total stays at </w:t>
-      </w:r>
-      <w:r>
-        <w:rPr>
-          <w:rFonts w:ascii="Consolas" w:cs="Consolas" w:eastAsia="Consolas" w:hAnsi="Consolas"/>
-          <w:sz w:val="20"/>
-          <w:szCs w:val="20"/>
-        </w:rPr>
-        <w:t xml:space="preserve">PEAK_2025</w:t>
-      </w:r>
-      <w:r>
-        <w:t xml:space="preserve"> × </w:t>
-      </w:r>
-      <w:r>
-        <w:rPr>
-          <w:rFonts w:ascii="Consolas" w:cs="Consolas" w:eastAsia="Consolas" w:hAnsi="Consolas"/>
-          <w:sz w:val="20"/>
-          <w:szCs w:val="20"/>
-        </w:rPr>
-        <w:t xml:space="preserve">PEAK_FACTOR</w:t>
-      </w:r>
-      <w:r>
-        <w:t xml:space="preserve">.</w:t>
-      </w:r>
-    </w:p>
-    <w:p>
-      <w:pPr>
-        <w:pStyle w:val="ListParagraph"/>
-        <w:numPr>
-          <w:ilvl w:val="0"/>
-          <w:numId w:val="2"/>
-        </w:numPr>
-      </w:pPr>
-      <w:r>
-        <w:t xml:space="preserve">It cannot run together with </w:t>
-      </w:r>
-      <w:r>
-        <w:rPr>
-          <w:rFonts w:ascii="Consolas" w:cs="Consolas" w:eastAsia="Consolas" w:hAnsi="Consolas"/>
-          <w:sz w:val="20"/>
-          <w:szCs w:val="20"/>
-        </w:rPr>
-        <w:t xml:space="preserve">PICKUP_CLUSTERS</w:t>
-      </w:r>
-      <w:r>
-        <w:t xml:space="preserve">. It is </w:t>
-      </w:r>
-      <w:r>
-        <w:rPr>
-          <w:rFonts w:ascii="Consolas" w:cs="Consolas" w:eastAsia="Consolas" w:hAnsi="Consolas"/>
-          <w:sz w:val="20"/>
-          <w:szCs w:val="20"/>
-        </w:rPr>
-        <w:t xml:space="preserve">none</w:t>
-      </w:r>
-      <w:r>
-        <w:t xml:space="preserve"> today.</w:t>
-      </w:r>
-    </w:p>
-    <w:p>
-      <w:pPr>
-        <w:pBdr>
-          <w:bottom w:val="single" w:color="BFBFBF" w:sz="6" w:space="1"/>
-        </w:pBdr>
-      </w:pPr>
-    </w:p>
-    <w:p>
-      <w:pPr>
-        <w:pStyle w:val="Heading1"/>
-      </w:pPr>
-      <w:r>
-        <w:t xml:space="preserve">6. Measured from CCP but not in the model yet</w:t>
+        <w:t xml:space="preserve">5. Measured from CCP but not in the model yet</w:t>
       </w:r>
     </w:p>
     <w:p>
@@ -4210,10 +4035,1854 @@
           <w:b/>
           <w:bCs/>
         </w:rPr>
-        <w:t xml:space="preserve">Every red-van site is above van capacity.</w:t>
-      </w:r>
-      <w:r>
-        <w:t xml:space="preserve"> The model's red van carries about 160 EA effective (180 physical), so each route would need 2–3 loads. Either vans unload and go out again, or part of the peak is not van-collected (e.g. counter lodgement at the depot).</w:t>
+        <w:t xml:space="preserve">Every red-van site is above van capacity per route.</w:t>
+      </w:r>
+      <w:r>
+        <w:t xml:space="preserve"> The model's red van carries about 160 EA effective (180 physical). Part of this is explained by pickup rounds (below); the rest is not.</w:t>
+      </w:r>
+    </w:p>
+    <w:p>
+      <w:pPr>
+        <w:spacing w:after="60" w:before="120"/>
+      </w:pPr>
+      <w:r>
+        <w:rPr>
+          <w:b/>
+          <w:bCs/>
+        </w:rPr>
+        <w:t xml:space="preserve">Pickup rounds: vans unload mid-shift and go out again</w:t>
+      </w:r>
+    </w:p>
+    <w:p>
+      <w:pPr>
+        <w:pStyle w:val="ListParagraph"/>
+        <w:numPr>
+          <w:ilvl w:val="0"/>
+          <w:numId w:val="2"/>
+        </w:numPr>
+      </w:pPr>
+      <w:r>
+        <w:t xml:space="preserve">A </w:t>
+      </w:r>
+      <w:r>
+        <w:rPr>
+          <w:b/>
+          <w:bCs/>
+        </w:rPr>
+        <w:t xml:space="preserve">round</w:t>
+      </w:r>
+      <w:r>
+        <w:t xml:space="preserve"> is a run of pickups ending at an </w:t>
+      </w:r>
+      <w:r>
+        <w:rPr>
+          <w:b/>
+          <w:bCs/>
+        </w:rPr>
+        <w:t xml:space="preserve">unload</w:t>
+      </w:r>
+      <w:r>
+        <w:t xml:space="preserve">: a delivery booking at one of our own buildings, in planned-time order along the route.</w:t>
+      </w:r>
+    </w:p>
+    <w:p>
+      <w:pPr>
+        <w:pStyle w:val="ListParagraph"/>
+        <w:numPr>
+          <w:ilvl w:val="1"/>
+          <w:numId w:val="2"/>
+        </w:numPr>
+      </w:pPr>
+      <w:r>
+        <w:t xml:space="preserve">A red van's drop at a delivery centre is not an unload. It is a relay ("Deliver all ex-Moorabbin DC").</w:t>
+      </w:r>
+    </w:p>
+    <w:p>
+      <w:pPr>
+        <w:pStyle w:val="ListParagraph"/>
+        <w:numPr>
+          <w:ilvl w:val="1"/>
+          <w:numId w:val="2"/>
+        </w:numPr>
+      </w:pPr>
+      <w:r>
+        <w:t xml:space="preserve">Pickups after the last booked unload count as one more round; the return to base is often not booked.</w:t>
+      </w:r>
+    </w:p>
+    <w:p>
+      <w:pPr>
+        <w:pStyle w:val="ListParagraph"/>
+        <w:numPr>
+          <w:ilvl w:val="0"/>
+          <w:numId w:val="2"/>
+        </w:numPr>
+      </w:pPr>
+      <w:r>
+        <w:rPr>
+          <w:b/>
+          <w:bCs/>
+        </w:rPr>
+        <w:t xml:space="preserve">Example: HX000, Sunshine West, Mon 18 May.</w:t>
+      </w:r>
+      <w:r>
+        <w:t xml:space="preserve"> 8 pickups (Footscray LPO/RP, posting boxes, CNP Brands, The Good Guys…) → unload at SWPDC at 13:25 (</w:t>
+      </w:r>
+      <w:r>
+        <w:rPr>
+          <w:i/>
+          <w:iCs/>
+        </w:rPr>
+        <w:t xml:space="preserve">"Deliver All Available – Customer Collections, Clearances"</w:t>
+      </w:r>
+      <w:r>
+        <w:t xml:space="preserve">) → 13 pickups (Woolworths CFC, Western Bulldogs, Chemist Warehouse…) → unload at SWPDC at 17:50. That is 21 stops per route, but 8 and 13 per trip.</w:t>
+      </w:r>
+    </w:p>
+    <w:p>
+      <w:pPr>
+        <w:pStyle w:val="ListParagraph"/>
+        <w:numPr>
+          <w:ilvl w:val="0"/>
+          <w:numId w:val="2"/>
+        </w:numPr>
+      </w:pPr>
+      <w:r>
+        <w:t xml:space="preserve">Output: the same </w:t>
+      </w:r>
+      <w:r>
+        <w:rPr>
+          <w:rFonts w:ascii="Consolas" w:cs="Consolas" w:eastAsia="Consolas" w:hAnsi="Consolas"/>
+          <w:sz w:val="20"/>
+          <w:szCs w:val="20"/>
+        </w:rPr>
+        <w:t xml:space="preserve">pickup_fleet_metrics.csv</w:t>
+      </w:r>
+      <w:r>
+        <w:t xml:space="preserve">, columns </w:t>
+      </w:r>
+      <w:r>
+        <w:rPr>
+          <w:rFonts w:ascii="Consolas" w:cs="Consolas" w:eastAsia="Consolas" w:hAnsi="Consolas"/>
+          <w:sz w:val="20"/>
+          <w:szCs w:val="20"/>
+        </w:rPr>
+        <w:t xml:space="preserve">rounds_per_day</w:t>
+      </w:r>
+      <w:r>
+        <w:t xml:space="preserve">, </w:t>
+      </w:r>
+      <w:r>
+        <w:rPr>
+          <w:rFonts w:ascii="Consolas" w:cs="Consolas" w:eastAsia="Consolas" w:hAnsi="Consolas"/>
+          <w:sz w:val="20"/>
+          <w:szCs w:val="20"/>
+        </w:rPr>
+        <w:t xml:space="preserve">rounds_per_route</w:t>
+      </w:r>
+      <w:r>
+        <w:t xml:space="preserve">, </w:t>
+      </w:r>
+      <w:r>
+        <w:rPr>
+          <w:rFonts w:ascii="Consolas" w:cs="Consolas" w:eastAsia="Consolas" w:hAnsi="Consolas"/>
+          <w:sz w:val="20"/>
+          <w:szCs w:val="20"/>
+        </w:rPr>
+        <w:t xml:space="preserve">multi_round_pct</w:t>
+      </w:r>
+      <w:r>
+        <w:t xml:space="preserve">, </w:t>
+      </w:r>
+      <w:r>
+        <w:rPr>
+          <w:rFonts w:ascii="Consolas" w:cs="Consolas" w:eastAsia="Consolas" w:hAnsi="Consolas"/>
+          <w:sz w:val="20"/>
+          <w:szCs w:val="20"/>
+        </w:rPr>
+        <w:t xml:space="preserve">stops_per_round</w:t>
+      </w:r>
+      <w:r>
+        <w:t xml:space="preserve">, </w:t>
+      </w:r>
+      <w:r>
+        <w:rPr>
+          <w:rFonts w:ascii="Consolas" w:cs="Consolas" w:eastAsia="Consolas" w:hAnsi="Consolas"/>
+          <w:sz w:val="20"/>
+          <w:szCs w:val="20"/>
+        </w:rPr>
+        <w:t xml:space="preserve">vol_per_round</w:t>
+      </w:r>
+      <w:r>
+        <w:t xml:space="preserve">.</w:t>
+      </w:r>
+    </w:p>
+    <w:tbl>
+      <w:tblPr>
+        <w:tblW w:type="dxa" w:w="9638"/>
+        <w:tblBorders>
+          <w:top w:val="single" w:color="auto" w:sz="4"/>
+          <w:left w:val="single" w:color="auto" w:sz="4"/>
+          <w:bottom w:val="single" w:color="auto" w:sz="4"/>
+          <w:right w:val="single" w:color="auto" w:sz="4"/>
+          <w:insideH w:val="single" w:color="auto" w:sz="4"/>
+          <w:insideV w:val="single" w:color="auto" w:sz="4"/>
+        </w:tblBorders>
+      </w:tblPr>
+      <w:tblGrid>
+        <w:gridCol w:w="1349"/>
+        <w:gridCol w:w="1928"/>
+        <w:gridCol w:w="1272"/>
+        <w:gridCol w:w="1272"/>
+        <w:gridCol w:w="1272"/>
+        <w:gridCol w:w="1272"/>
+        <w:gridCol w:w="1273"/>
+      </w:tblGrid>
+      <w:tr>
+        <w:trPr>
+          <w:tblHeader/>
+        </w:trPr>
+        <w:tc>
+          <w:tcPr>
+            <w:tcW w:type="dxa" w:w="1349"/>
+            <w:tcBorders>
+              <w:top w:val="single" w:color="BFBFBF" w:sz="4"/>
+              <w:left w:val="single" w:color="BFBFBF" w:sz="4"/>
+              <w:bottom w:val="single" w:color="BFBFBF" w:sz="4"/>
+              <w:right w:val="single" w:color="BFBFBF" w:sz="4"/>
+            </w:tcBorders>
+            <w:shd w:fill="DCE6F1" w:color="auto" w:val="clear"/>
+            <w:tcMar>
+              <w:top w:type="dxa" w:w="40"/>
+              <w:left w:type="dxa" w:w="80"/>
+              <w:bottom w:type="dxa" w:w="40"/>
+              <w:right w:type="dxa" w:w="80"/>
+            </w:tcMar>
+          </w:tcPr>
+          <w:p>
+            <w:pPr>
+              <w:jc w:val="left"/>
+            </w:pPr>
+            <w:r>
+              <w:rPr>
+                <w:b/>
+                <w:bCs/>
+                <w:sz w:val="18"/>
+                <w:szCs w:val="18"/>
+              </w:rPr>
+              <w:t xml:space="preserve">Site</w:t>
+            </w:r>
+          </w:p>
+        </w:tc>
+        <w:tc>
+          <w:tcPr>
+            <w:tcW w:type="dxa" w:w="1928"/>
+            <w:tcBorders>
+              <w:top w:val="single" w:color="BFBFBF" w:sz="4"/>
+              <w:left w:val="single" w:color="BFBFBF" w:sz="4"/>
+              <w:bottom w:val="single" w:color="BFBFBF" w:sz="4"/>
+              <w:right w:val="single" w:color="BFBFBF" w:sz="4"/>
+            </w:tcBorders>
+            <w:shd w:fill="DCE6F1" w:color="auto" w:val="clear"/>
+            <w:tcMar>
+              <w:top w:type="dxa" w:w="40"/>
+              <w:left w:type="dxa" w:w="80"/>
+              <w:bottom w:type="dxa" w:w="40"/>
+              <w:right w:type="dxa" w:w="80"/>
+            </w:tcMar>
+          </w:tcPr>
+          <w:p>
+            <w:pPr>
+              <w:jc w:val="left"/>
+            </w:pPr>
+            <w:r>
+              <w:rPr>
+                <w:b/>
+                <w:bCs/>
+                <w:sz w:val="18"/>
+                <w:szCs w:val="18"/>
+              </w:rPr>
+              <w:t xml:space="preserve">Stops/route</w:t>
+            </w:r>
+          </w:p>
+        </w:tc>
+        <w:tc>
+          <w:tcPr>
+            <w:tcW w:type="dxa" w:w="1272"/>
+            <w:tcBorders>
+              <w:top w:val="single" w:color="BFBFBF" w:sz="4"/>
+              <w:left w:val="single" w:color="BFBFBF" w:sz="4"/>
+              <w:bottom w:val="single" w:color="BFBFBF" w:sz="4"/>
+              <w:right w:val="single" w:color="BFBFBF" w:sz="4"/>
+            </w:tcBorders>
+            <w:shd w:fill="DCE6F1" w:color="auto" w:val="clear"/>
+            <w:tcMar>
+              <w:top w:type="dxa" w:w="40"/>
+              <w:left w:type="dxa" w:w="80"/>
+              <w:bottom w:type="dxa" w:w="40"/>
+              <w:right w:type="dxa" w:w="80"/>
+            </w:tcMar>
+          </w:tcPr>
+          <w:p>
+            <w:pPr>
+              <w:jc w:val="left"/>
+            </w:pPr>
+            <w:r>
+              <w:rPr>
+                <w:b/>
+                <w:bCs/>
+                <w:sz w:val="18"/>
+                <w:szCs w:val="18"/>
+              </w:rPr>
+              <w:t xml:space="preserve">Rounds/route</w:t>
+            </w:r>
+          </w:p>
+        </w:tc>
+        <w:tc>
+          <w:tcPr>
+            <w:tcW w:type="dxa" w:w="1272"/>
+            <w:tcBorders>
+              <w:top w:val="single" w:color="BFBFBF" w:sz="4"/>
+              <w:left w:val="single" w:color="BFBFBF" w:sz="4"/>
+              <w:bottom w:val="single" w:color="BFBFBF" w:sz="4"/>
+              <w:right w:val="single" w:color="BFBFBF" w:sz="4"/>
+            </w:tcBorders>
+            <w:shd w:fill="DCE6F1" w:color="auto" w:val="clear"/>
+            <w:tcMar>
+              <w:top w:type="dxa" w:w="40"/>
+              <w:left w:type="dxa" w:w="80"/>
+              <w:bottom w:type="dxa" w:w="40"/>
+              <w:right w:type="dxa" w:w="80"/>
+            </w:tcMar>
+          </w:tcPr>
+          <w:p>
+            <w:pPr>
+              <w:jc w:val="left"/>
+            </w:pPr>
+            <w:r>
+              <w:rPr>
+                <w:b/>
+                <w:bCs/>
+                <w:sz w:val="18"/>
+                <w:szCs w:val="18"/>
+              </w:rPr>
+              <w:t xml:space="preserve">Routes with 2+ rounds</w:t>
+            </w:r>
+          </w:p>
+        </w:tc>
+        <w:tc>
+          <w:tcPr>
+            <w:tcW w:type="dxa" w:w="1272"/>
+            <w:tcBorders>
+              <w:top w:val="single" w:color="BFBFBF" w:sz="4"/>
+              <w:left w:val="single" w:color="BFBFBF" w:sz="4"/>
+              <w:bottom w:val="single" w:color="BFBFBF" w:sz="4"/>
+              <w:right w:val="single" w:color="BFBFBF" w:sz="4"/>
+            </w:tcBorders>
+            <w:shd w:fill="DCE6F1" w:color="auto" w:val="clear"/>
+            <w:tcMar>
+              <w:top w:type="dxa" w:w="40"/>
+              <w:left w:type="dxa" w:w="80"/>
+              <w:bottom w:type="dxa" w:w="40"/>
+              <w:right w:type="dxa" w:w="80"/>
+            </w:tcMar>
+          </w:tcPr>
+          <w:p>
+            <w:pPr>
+              <w:jc w:val="left"/>
+            </w:pPr>
+            <w:r>
+              <w:rPr>
+                <w:b/>
+                <w:bCs/>
+                <w:sz w:val="18"/>
+                <w:szCs w:val="18"/>
+              </w:rPr>
+              <w:t xml:space="preserve">Stops/round</w:t>
+            </w:r>
+          </w:p>
+        </w:tc>
+        <w:tc>
+          <w:tcPr>
+            <w:tcW w:type="dxa" w:w="1272"/>
+            <w:tcBorders>
+              <w:top w:val="single" w:color="BFBFBF" w:sz="4"/>
+              <w:left w:val="single" w:color="BFBFBF" w:sz="4"/>
+              <w:bottom w:val="single" w:color="BFBFBF" w:sz="4"/>
+              <w:right w:val="single" w:color="BFBFBF" w:sz="4"/>
+            </w:tcBorders>
+            <w:shd w:fill="DCE6F1" w:color="auto" w:val="clear"/>
+            <w:tcMar>
+              <w:top w:type="dxa" w:w="40"/>
+              <w:left w:type="dxa" w:w="80"/>
+              <w:bottom w:type="dxa" w:w="40"/>
+              <w:right w:type="dxa" w:w="80"/>
+            </w:tcMar>
+          </w:tcPr>
+          <w:p>
+            <w:pPr>
+              <w:jc w:val="left"/>
+            </w:pPr>
+            <w:r>
+              <w:rPr>
+                <w:b/>
+                <w:bCs/>
+                <w:sz w:val="18"/>
+                <w:szCs w:val="18"/>
+              </w:rPr>
+              <w:t xml:space="preserve">Volume/vehicle (day)</w:t>
+            </w:r>
+          </w:p>
+        </w:tc>
+        <w:tc>
+          <w:tcPr>
+            <w:tcW w:type="dxa" w:w="1273"/>
+            <w:tcBorders>
+              <w:top w:val="single" w:color="BFBFBF" w:sz="4"/>
+              <w:left w:val="single" w:color="BFBFBF" w:sz="4"/>
+              <w:bottom w:val="single" w:color="BFBFBF" w:sz="4"/>
+              <w:right w:val="single" w:color="BFBFBF" w:sz="4"/>
+            </w:tcBorders>
+            <w:shd w:fill="DCE6F1" w:color="auto" w:val="clear"/>
+            <w:tcMar>
+              <w:top w:type="dxa" w:w="40"/>
+              <w:left w:type="dxa" w:w="80"/>
+              <w:bottom w:type="dxa" w:w="40"/>
+              <w:right w:type="dxa" w:w="80"/>
+            </w:tcMar>
+          </w:tcPr>
+          <w:p>
+            <w:pPr>
+              <w:jc w:val="left"/>
+            </w:pPr>
+            <w:r>
+              <w:rPr>
+                <w:b/>
+                <w:bCs/>
+                <w:sz w:val="18"/>
+                <w:szCs w:val="18"/>
+              </w:rPr>
+              <w:t xml:space="preserve">Volume/round</w:t>
+            </w:r>
+          </w:p>
+        </w:tc>
+      </w:tr>
+      <w:tr>
+        <w:trPr>
+          <w:tblHeader w:val="off"/>
+        </w:trPr>
+        <w:tc>
+          <w:tcPr>
+            <w:tcW w:type="dxa" w:w="1349"/>
+            <w:tcBorders>
+              <w:top w:val="single" w:color="BFBFBF" w:sz="4"/>
+              <w:left w:val="single" w:color="BFBFBF" w:sz="4"/>
+              <w:bottom w:val="single" w:color="BFBFBF" w:sz="4"/>
+              <w:right w:val="single" w:color="BFBFBF" w:sz="4"/>
+            </w:tcBorders>
+            <w:tcMar>
+              <w:top w:type="dxa" w:w="40"/>
+              <w:left w:type="dxa" w:w="80"/>
+              <w:bottom w:type="dxa" w:w="40"/>
+              <w:right w:type="dxa" w:w="80"/>
+            </w:tcMar>
+          </w:tcPr>
+          <w:p>
+            <w:pPr>
+              <w:jc w:val="left"/>
+            </w:pPr>
+            <w:r>
+              <w:rPr>
+                <w:sz w:val="18"/>
+                <w:szCs w:val="18"/>
+              </w:rPr>
+              <w:t xml:space="preserve">Bayswater</w:t>
+            </w:r>
+          </w:p>
+        </w:tc>
+        <w:tc>
+          <w:tcPr>
+            <w:tcW w:type="dxa" w:w="1928"/>
+            <w:tcBorders>
+              <w:top w:val="single" w:color="BFBFBF" w:sz="4"/>
+              <w:left w:val="single" w:color="BFBFBF" w:sz="4"/>
+              <w:bottom w:val="single" w:color="BFBFBF" w:sz="4"/>
+              <w:right w:val="single" w:color="BFBFBF" w:sz="4"/>
+            </w:tcBorders>
+            <w:tcMar>
+              <w:top w:type="dxa" w:w="40"/>
+              <w:left w:type="dxa" w:w="80"/>
+              <w:bottom w:type="dxa" w:w="40"/>
+              <w:right w:type="dxa" w:w="80"/>
+            </w:tcMar>
+          </w:tcPr>
+          <w:p>
+            <w:pPr>
+              <w:jc w:val="left"/>
+            </w:pPr>
+            <w:r>
+              <w:rPr>
+                <w:sz w:val="18"/>
+                <w:szCs w:val="18"/>
+              </w:rPr>
+              <w:t xml:space="preserve">20.0</w:t>
+            </w:r>
+          </w:p>
+        </w:tc>
+        <w:tc>
+          <w:tcPr>
+            <w:tcW w:type="dxa" w:w="1272"/>
+            <w:tcBorders>
+              <w:top w:val="single" w:color="BFBFBF" w:sz="4"/>
+              <w:left w:val="single" w:color="BFBFBF" w:sz="4"/>
+              <w:bottom w:val="single" w:color="BFBFBF" w:sz="4"/>
+              <w:right w:val="single" w:color="BFBFBF" w:sz="4"/>
+            </w:tcBorders>
+            <w:tcMar>
+              <w:top w:type="dxa" w:w="40"/>
+              <w:left w:type="dxa" w:w="80"/>
+              <w:bottom w:type="dxa" w:w="40"/>
+              <w:right w:type="dxa" w:w="80"/>
+            </w:tcMar>
+          </w:tcPr>
+          <w:p>
+            <w:pPr>
+              <w:jc w:val="right"/>
+            </w:pPr>
+            <w:r>
+              <w:rPr>
+                <w:sz w:val="18"/>
+                <w:szCs w:val="18"/>
+              </w:rPr>
+              <w:t xml:space="preserve">1.56</w:t>
+            </w:r>
+          </w:p>
+        </w:tc>
+        <w:tc>
+          <w:tcPr>
+            <w:tcW w:type="dxa" w:w="1272"/>
+            <w:tcBorders>
+              <w:top w:val="single" w:color="BFBFBF" w:sz="4"/>
+              <w:left w:val="single" w:color="BFBFBF" w:sz="4"/>
+              <w:bottom w:val="single" w:color="BFBFBF" w:sz="4"/>
+              <w:right w:val="single" w:color="BFBFBF" w:sz="4"/>
+            </w:tcBorders>
+            <w:tcMar>
+              <w:top w:type="dxa" w:w="40"/>
+              <w:left w:type="dxa" w:w="80"/>
+              <w:bottom w:type="dxa" w:w="40"/>
+              <w:right w:type="dxa" w:w="80"/>
+            </w:tcMar>
+          </w:tcPr>
+          <w:p>
+            <w:pPr>
+              <w:jc w:val="right"/>
+            </w:pPr>
+            <w:r>
+              <w:rPr>
+                <w:sz w:val="18"/>
+                <w:szCs w:val="18"/>
+              </w:rPr>
+              <w:t xml:space="preserve">51%</w:t>
+            </w:r>
+          </w:p>
+        </w:tc>
+        <w:tc>
+          <w:tcPr>
+            <w:tcW w:type="dxa" w:w="1272"/>
+            <w:tcBorders>
+              <w:top w:val="single" w:color="BFBFBF" w:sz="4"/>
+              <w:left w:val="single" w:color="BFBFBF" w:sz="4"/>
+              <w:bottom w:val="single" w:color="BFBFBF" w:sz="4"/>
+              <w:right w:val="single" w:color="BFBFBF" w:sz="4"/>
+            </w:tcBorders>
+            <w:tcMar>
+              <w:top w:type="dxa" w:w="40"/>
+              <w:left w:type="dxa" w:w="80"/>
+              <w:bottom w:type="dxa" w:w="40"/>
+              <w:right w:type="dxa" w:w="80"/>
+            </w:tcMar>
+          </w:tcPr>
+          <w:p>
+            <w:pPr>
+              <w:jc w:val="right"/>
+            </w:pPr>
+            <w:r>
+              <w:rPr>
+                <w:sz w:val="18"/>
+                <w:szCs w:val="18"/>
+              </w:rPr>
+              <w:t xml:space="preserve">12.8</w:t>
+            </w:r>
+          </w:p>
+        </w:tc>
+        <w:tc>
+          <w:tcPr>
+            <w:tcW w:type="dxa" w:w="1272"/>
+            <w:tcBorders>
+              <w:top w:val="single" w:color="BFBFBF" w:sz="4"/>
+              <w:left w:val="single" w:color="BFBFBF" w:sz="4"/>
+              <w:bottom w:val="single" w:color="BFBFBF" w:sz="4"/>
+              <w:right w:val="single" w:color="BFBFBF" w:sz="4"/>
+            </w:tcBorders>
+            <w:tcMar>
+              <w:top w:type="dxa" w:w="40"/>
+              <w:left w:type="dxa" w:w="80"/>
+              <w:bottom w:type="dxa" w:w="40"/>
+              <w:right w:type="dxa" w:w="80"/>
+            </w:tcMar>
+          </w:tcPr>
+          <w:p>
+            <w:pPr>
+              <w:jc w:val="right"/>
+            </w:pPr>
+            <w:r>
+              <w:rPr>
+                <w:sz w:val="18"/>
+                <w:szCs w:val="18"/>
+              </w:rPr>
+              <w:t xml:space="preserve">367</w:t>
+            </w:r>
+          </w:p>
+        </w:tc>
+        <w:tc>
+          <w:tcPr>
+            <w:tcW w:type="dxa" w:w="1273"/>
+            <w:tcBorders>
+              <w:top w:val="single" w:color="BFBFBF" w:sz="4"/>
+              <w:left w:val="single" w:color="BFBFBF" w:sz="4"/>
+              <w:bottom w:val="single" w:color="BFBFBF" w:sz="4"/>
+              <w:right w:val="single" w:color="BFBFBF" w:sz="4"/>
+            </w:tcBorders>
+            <w:tcMar>
+              <w:top w:type="dxa" w:w="40"/>
+              <w:left w:type="dxa" w:w="80"/>
+              <w:bottom w:type="dxa" w:w="40"/>
+              <w:right w:type="dxa" w:w="80"/>
+            </w:tcMar>
+          </w:tcPr>
+          <w:p>
+            <w:pPr>
+              <w:jc w:val="right"/>
+            </w:pPr>
+            <w:r>
+              <w:rPr>
+                <w:sz w:val="18"/>
+                <w:szCs w:val="18"/>
+              </w:rPr>
+              <w:t xml:space="preserve">235</w:t>
+            </w:r>
+          </w:p>
+        </w:tc>
+      </w:tr>
+      <w:tr>
+        <w:trPr>
+          <w:tblHeader w:val="off"/>
+        </w:trPr>
+        <w:tc>
+          <w:tcPr>
+            <w:tcW w:type="dxa" w:w="1349"/>
+            <w:tcBorders>
+              <w:top w:val="single" w:color="BFBFBF" w:sz="4"/>
+              <w:left w:val="single" w:color="BFBFBF" w:sz="4"/>
+              <w:bottom w:val="single" w:color="BFBFBF" w:sz="4"/>
+              <w:right w:val="single" w:color="BFBFBF" w:sz="4"/>
+            </w:tcBorders>
+            <w:tcMar>
+              <w:top w:type="dxa" w:w="40"/>
+              <w:left w:type="dxa" w:w="80"/>
+              <w:bottom w:type="dxa" w:w="40"/>
+              <w:right w:type="dxa" w:w="80"/>
+            </w:tcMar>
+          </w:tcPr>
+          <w:p>
+            <w:pPr>
+              <w:jc w:val="left"/>
+            </w:pPr>
+            <w:r>
+              <w:rPr>
+                <w:sz w:val="18"/>
+                <w:szCs w:val="18"/>
+              </w:rPr>
+              <w:t xml:space="preserve">Dandenong South</w:t>
+            </w:r>
+          </w:p>
+        </w:tc>
+        <w:tc>
+          <w:tcPr>
+            <w:tcW w:type="dxa" w:w="1928"/>
+            <w:tcBorders>
+              <w:top w:val="single" w:color="BFBFBF" w:sz="4"/>
+              <w:left w:val="single" w:color="BFBFBF" w:sz="4"/>
+              <w:bottom w:val="single" w:color="BFBFBF" w:sz="4"/>
+              <w:right w:val="single" w:color="BFBFBF" w:sz="4"/>
+            </w:tcBorders>
+            <w:tcMar>
+              <w:top w:type="dxa" w:w="40"/>
+              <w:left w:type="dxa" w:w="80"/>
+              <w:bottom w:type="dxa" w:w="40"/>
+              <w:right w:type="dxa" w:w="80"/>
+            </w:tcMar>
+          </w:tcPr>
+          <w:p>
+            <w:pPr>
+              <w:jc w:val="left"/>
+            </w:pPr>
+            <w:r>
+              <w:rPr>
+                <w:sz w:val="18"/>
+                <w:szCs w:val="18"/>
+              </w:rPr>
+              <w:t xml:space="preserve">22.9</w:t>
+            </w:r>
+          </w:p>
+        </w:tc>
+        <w:tc>
+          <w:tcPr>
+            <w:tcW w:type="dxa" w:w="1272"/>
+            <w:tcBorders>
+              <w:top w:val="single" w:color="BFBFBF" w:sz="4"/>
+              <w:left w:val="single" w:color="BFBFBF" w:sz="4"/>
+              <w:bottom w:val="single" w:color="BFBFBF" w:sz="4"/>
+              <w:right w:val="single" w:color="BFBFBF" w:sz="4"/>
+            </w:tcBorders>
+            <w:tcMar>
+              <w:top w:type="dxa" w:w="40"/>
+              <w:left w:type="dxa" w:w="80"/>
+              <w:bottom w:type="dxa" w:w="40"/>
+              <w:right w:type="dxa" w:w="80"/>
+            </w:tcMar>
+          </w:tcPr>
+          <w:p>
+            <w:pPr>
+              <w:jc w:val="right"/>
+            </w:pPr>
+            <w:r>
+              <w:rPr>
+                <w:sz w:val="18"/>
+                <w:szCs w:val="18"/>
+              </w:rPr>
+              <w:t xml:space="preserve">1.71</w:t>
+            </w:r>
+          </w:p>
+        </w:tc>
+        <w:tc>
+          <w:tcPr>
+            <w:tcW w:type="dxa" w:w="1272"/>
+            <w:tcBorders>
+              <w:top w:val="single" w:color="BFBFBF" w:sz="4"/>
+              <w:left w:val="single" w:color="BFBFBF" w:sz="4"/>
+              <w:bottom w:val="single" w:color="BFBFBF" w:sz="4"/>
+              <w:right w:val="single" w:color="BFBFBF" w:sz="4"/>
+            </w:tcBorders>
+            <w:tcMar>
+              <w:top w:type="dxa" w:w="40"/>
+              <w:left w:type="dxa" w:w="80"/>
+              <w:bottom w:type="dxa" w:w="40"/>
+              <w:right w:type="dxa" w:w="80"/>
+            </w:tcMar>
+          </w:tcPr>
+          <w:p>
+            <w:pPr>
+              <w:jc w:val="right"/>
+            </w:pPr>
+            <w:r>
+              <w:rPr>
+                <w:sz w:val="18"/>
+                <w:szCs w:val="18"/>
+              </w:rPr>
+              <w:t xml:space="preserve">67%</w:t>
+            </w:r>
+          </w:p>
+        </w:tc>
+        <w:tc>
+          <w:tcPr>
+            <w:tcW w:type="dxa" w:w="1272"/>
+            <w:tcBorders>
+              <w:top w:val="single" w:color="BFBFBF" w:sz="4"/>
+              <w:left w:val="single" w:color="BFBFBF" w:sz="4"/>
+              <w:bottom w:val="single" w:color="BFBFBF" w:sz="4"/>
+              <w:right w:val="single" w:color="BFBFBF" w:sz="4"/>
+            </w:tcBorders>
+            <w:tcMar>
+              <w:top w:type="dxa" w:w="40"/>
+              <w:left w:type="dxa" w:w="80"/>
+              <w:bottom w:type="dxa" w:w="40"/>
+              <w:right w:type="dxa" w:w="80"/>
+            </w:tcMar>
+          </w:tcPr>
+          <w:p>
+            <w:pPr>
+              <w:jc w:val="right"/>
+            </w:pPr>
+            <w:r>
+              <w:rPr>
+                <w:sz w:val="18"/>
+                <w:szCs w:val="18"/>
+              </w:rPr>
+              <w:t xml:space="preserve">13.4</w:t>
+            </w:r>
+          </w:p>
+        </w:tc>
+        <w:tc>
+          <w:tcPr>
+            <w:tcW w:type="dxa" w:w="1272"/>
+            <w:tcBorders>
+              <w:top w:val="single" w:color="BFBFBF" w:sz="4"/>
+              <w:left w:val="single" w:color="BFBFBF" w:sz="4"/>
+              <w:bottom w:val="single" w:color="BFBFBF" w:sz="4"/>
+              <w:right w:val="single" w:color="BFBFBF" w:sz="4"/>
+            </w:tcBorders>
+            <w:tcMar>
+              <w:top w:type="dxa" w:w="40"/>
+              <w:left w:type="dxa" w:w="80"/>
+              <w:bottom w:type="dxa" w:w="40"/>
+              <w:right w:type="dxa" w:w="80"/>
+            </w:tcMar>
+          </w:tcPr>
+          <w:p>
+            <w:pPr>
+              <w:jc w:val="right"/>
+            </w:pPr>
+            <w:r>
+              <w:rPr>
+                <w:sz w:val="18"/>
+                <w:szCs w:val="18"/>
+              </w:rPr>
+              <w:t xml:space="preserve">510</w:t>
+            </w:r>
+          </w:p>
+        </w:tc>
+        <w:tc>
+          <w:tcPr>
+            <w:tcW w:type="dxa" w:w="1273"/>
+            <w:tcBorders>
+              <w:top w:val="single" w:color="BFBFBF" w:sz="4"/>
+              <w:left w:val="single" w:color="BFBFBF" w:sz="4"/>
+              <w:bottom w:val="single" w:color="BFBFBF" w:sz="4"/>
+              <w:right w:val="single" w:color="BFBFBF" w:sz="4"/>
+            </w:tcBorders>
+            <w:tcMar>
+              <w:top w:type="dxa" w:w="40"/>
+              <w:left w:type="dxa" w:w="80"/>
+              <w:bottom w:type="dxa" w:w="40"/>
+              <w:right w:type="dxa" w:w="80"/>
+            </w:tcMar>
+          </w:tcPr>
+          <w:p>
+            <w:pPr>
+              <w:jc w:val="right"/>
+            </w:pPr>
+            <w:r>
+              <w:rPr>
+                <w:sz w:val="18"/>
+                <w:szCs w:val="18"/>
+              </w:rPr>
+              <w:t xml:space="preserve">299</w:t>
+            </w:r>
+          </w:p>
+        </w:tc>
+      </w:tr>
+      <w:tr>
+        <w:trPr>
+          <w:tblHeader w:val="off"/>
+        </w:trPr>
+        <w:tc>
+          <w:tcPr>
+            <w:tcW w:type="dxa" w:w="1349"/>
+            <w:tcBorders>
+              <w:top w:val="single" w:color="BFBFBF" w:sz="4"/>
+              <w:left w:val="single" w:color="BFBFBF" w:sz="4"/>
+              <w:bottom w:val="single" w:color="BFBFBF" w:sz="4"/>
+              <w:right w:val="single" w:color="BFBFBF" w:sz="4"/>
+            </w:tcBorders>
+            <w:tcMar>
+              <w:top w:type="dxa" w:w="40"/>
+              <w:left w:type="dxa" w:w="80"/>
+              <w:bottom w:type="dxa" w:w="40"/>
+              <w:right w:type="dxa" w:w="80"/>
+            </w:tcMar>
+          </w:tcPr>
+          <w:p>
+            <w:pPr>
+              <w:jc w:val="left"/>
+            </w:pPr>
+            <w:r>
+              <w:rPr>
+                <w:sz w:val="18"/>
+                <w:szCs w:val="18"/>
+              </w:rPr>
+              <w:t xml:space="preserve">Melbourne North</w:t>
+            </w:r>
+          </w:p>
+        </w:tc>
+        <w:tc>
+          <w:tcPr>
+            <w:tcW w:type="dxa" w:w="1928"/>
+            <w:tcBorders>
+              <w:top w:val="single" w:color="BFBFBF" w:sz="4"/>
+              <w:left w:val="single" w:color="BFBFBF" w:sz="4"/>
+              <w:bottom w:val="single" w:color="BFBFBF" w:sz="4"/>
+              <w:right w:val="single" w:color="BFBFBF" w:sz="4"/>
+            </w:tcBorders>
+            <w:tcMar>
+              <w:top w:type="dxa" w:w="40"/>
+              <w:left w:type="dxa" w:w="80"/>
+              <w:bottom w:type="dxa" w:w="40"/>
+              <w:right w:type="dxa" w:w="80"/>
+            </w:tcMar>
+          </w:tcPr>
+          <w:p>
+            <w:pPr>
+              <w:jc w:val="left"/>
+            </w:pPr>
+            <w:r>
+              <w:rPr>
+                <w:sz w:val="18"/>
+                <w:szCs w:val="18"/>
+              </w:rPr>
+              <w:t xml:space="preserve">16.0</w:t>
+            </w:r>
+          </w:p>
+        </w:tc>
+        <w:tc>
+          <w:tcPr>
+            <w:tcW w:type="dxa" w:w="1272"/>
+            <w:tcBorders>
+              <w:top w:val="single" w:color="BFBFBF" w:sz="4"/>
+              <w:left w:val="single" w:color="BFBFBF" w:sz="4"/>
+              <w:bottom w:val="single" w:color="BFBFBF" w:sz="4"/>
+              <w:right w:val="single" w:color="BFBFBF" w:sz="4"/>
+            </w:tcBorders>
+            <w:tcMar>
+              <w:top w:type="dxa" w:w="40"/>
+              <w:left w:type="dxa" w:w="80"/>
+              <w:bottom w:type="dxa" w:w="40"/>
+              <w:right w:type="dxa" w:w="80"/>
+            </w:tcMar>
+          </w:tcPr>
+          <w:p>
+            <w:pPr>
+              <w:jc w:val="right"/>
+            </w:pPr>
+            <w:r>
+              <w:rPr>
+                <w:sz w:val="18"/>
+                <w:szCs w:val="18"/>
+              </w:rPr>
+              <w:t xml:space="preserve">1.39</w:t>
+            </w:r>
+          </w:p>
+        </w:tc>
+        <w:tc>
+          <w:tcPr>
+            <w:tcW w:type="dxa" w:w="1272"/>
+            <w:tcBorders>
+              <w:top w:val="single" w:color="BFBFBF" w:sz="4"/>
+              <w:left w:val="single" w:color="BFBFBF" w:sz="4"/>
+              <w:bottom w:val="single" w:color="BFBFBF" w:sz="4"/>
+              <w:right w:val="single" w:color="BFBFBF" w:sz="4"/>
+            </w:tcBorders>
+            <w:tcMar>
+              <w:top w:type="dxa" w:w="40"/>
+              <w:left w:type="dxa" w:w="80"/>
+              <w:bottom w:type="dxa" w:w="40"/>
+              <w:right w:type="dxa" w:w="80"/>
+            </w:tcMar>
+          </w:tcPr>
+          <w:p>
+            <w:pPr>
+              <w:jc w:val="right"/>
+            </w:pPr>
+            <w:r>
+              <w:rPr>
+                <w:sz w:val="18"/>
+                <w:szCs w:val="18"/>
+              </w:rPr>
+              <w:t xml:space="preserve">35%</w:t>
+            </w:r>
+          </w:p>
+        </w:tc>
+        <w:tc>
+          <w:tcPr>
+            <w:tcW w:type="dxa" w:w="1272"/>
+            <w:tcBorders>
+              <w:top w:val="single" w:color="BFBFBF" w:sz="4"/>
+              <w:left w:val="single" w:color="BFBFBF" w:sz="4"/>
+              <w:bottom w:val="single" w:color="BFBFBF" w:sz="4"/>
+              <w:right w:val="single" w:color="BFBFBF" w:sz="4"/>
+            </w:tcBorders>
+            <w:tcMar>
+              <w:top w:type="dxa" w:w="40"/>
+              <w:left w:type="dxa" w:w="80"/>
+              <w:bottom w:type="dxa" w:w="40"/>
+              <w:right w:type="dxa" w:w="80"/>
+            </w:tcMar>
+          </w:tcPr>
+          <w:p>
+            <w:pPr>
+              <w:jc w:val="right"/>
+            </w:pPr>
+            <w:r>
+              <w:rPr>
+                <w:sz w:val="18"/>
+                <w:szCs w:val="18"/>
+              </w:rPr>
+              <w:t xml:space="preserve">11.5</w:t>
+            </w:r>
+          </w:p>
+        </w:tc>
+        <w:tc>
+          <w:tcPr>
+            <w:tcW w:type="dxa" w:w="1272"/>
+            <w:tcBorders>
+              <w:top w:val="single" w:color="BFBFBF" w:sz="4"/>
+              <w:left w:val="single" w:color="BFBFBF" w:sz="4"/>
+              <w:bottom w:val="single" w:color="BFBFBF" w:sz="4"/>
+              <w:right w:val="single" w:color="BFBFBF" w:sz="4"/>
+            </w:tcBorders>
+            <w:tcMar>
+              <w:top w:type="dxa" w:w="40"/>
+              <w:left w:type="dxa" w:w="80"/>
+              <w:bottom w:type="dxa" w:w="40"/>
+              <w:right w:type="dxa" w:w="80"/>
+            </w:tcMar>
+          </w:tcPr>
+          <w:p>
+            <w:pPr>
+              <w:jc w:val="right"/>
+            </w:pPr>
+            <w:r>
+              <w:rPr>
+                <w:sz w:val="18"/>
+                <w:szCs w:val="18"/>
+              </w:rPr>
+              <w:t xml:space="preserve">424</w:t>
+            </w:r>
+          </w:p>
+        </w:tc>
+        <w:tc>
+          <w:tcPr>
+            <w:tcW w:type="dxa" w:w="1273"/>
+            <w:tcBorders>
+              <w:top w:val="single" w:color="BFBFBF" w:sz="4"/>
+              <w:left w:val="single" w:color="BFBFBF" w:sz="4"/>
+              <w:bottom w:val="single" w:color="BFBFBF" w:sz="4"/>
+              <w:right w:val="single" w:color="BFBFBF" w:sz="4"/>
+            </w:tcBorders>
+            <w:tcMar>
+              <w:top w:type="dxa" w:w="40"/>
+              <w:left w:type="dxa" w:w="80"/>
+              <w:bottom w:type="dxa" w:w="40"/>
+              <w:right w:type="dxa" w:w="80"/>
+            </w:tcMar>
+          </w:tcPr>
+          <w:p>
+            <w:pPr>
+              <w:jc w:val="right"/>
+            </w:pPr>
+            <w:r>
+              <w:rPr>
+                <w:sz w:val="18"/>
+                <w:szCs w:val="18"/>
+              </w:rPr>
+              <w:t xml:space="preserve">305</w:t>
+            </w:r>
+          </w:p>
+        </w:tc>
+      </w:tr>
+      <w:tr>
+        <w:trPr>
+          <w:tblHeader w:val="off"/>
+        </w:trPr>
+        <w:tc>
+          <w:tcPr>
+            <w:tcW w:type="dxa" w:w="1349"/>
+            <w:tcBorders>
+              <w:top w:val="single" w:color="BFBFBF" w:sz="4"/>
+              <w:left w:val="single" w:color="BFBFBF" w:sz="4"/>
+              <w:bottom w:val="single" w:color="BFBFBF" w:sz="4"/>
+              <w:right w:val="single" w:color="BFBFBF" w:sz="4"/>
+            </w:tcBorders>
+            <w:tcMar>
+              <w:top w:type="dxa" w:w="40"/>
+              <w:left w:type="dxa" w:w="80"/>
+              <w:bottom w:type="dxa" w:w="40"/>
+              <w:right w:type="dxa" w:w="80"/>
+            </w:tcMar>
+          </w:tcPr>
+          <w:p>
+            <w:pPr>
+              <w:jc w:val="left"/>
+            </w:pPr>
+            <w:r>
+              <w:rPr>
+                <w:sz w:val="18"/>
+                <w:szCs w:val="18"/>
+              </w:rPr>
+              <w:t xml:space="preserve">Oakleigh South</w:t>
+            </w:r>
+          </w:p>
+        </w:tc>
+        <w:tc>
+          <w:tcPr>
+            <w:tcW w:type="dxa" w:w="1928"/>
+            <w:tcBorders>
+              <w:top w:val="single" w:color="BFBFBF" w:sz="4"/>
+              <w:left w:val="single" w:color="BFBFBF" w:sz="4"/>
+              <w:bottom w:val="single" w:color="BFBFBF" w:sz="4"/>
+              <w:right w:val="single" w:color="BFBFBF" w:sz="4"/>
+            </w:tcBorders>
+            <w:tcMar>
+              <w:top w:type="dxa" w:w="40"/>
+              <w:left w:type="dxa" w:w="80"/>
+              <w:bottom w:type="dxa" w:w="40"/>
+              <w:right w:type="dxa" w:w="80"/>
+            </w:tcMar>
+          </w:tcPr>
+          <w:p>
+            <w:pPr>
+              <w:jc w:val="left"/>
+            </w:pPr>
+            <w:r>
+              <w:rPr>
+                <w:sz w:val="18"/>
+                <w:szCs w:val="18"/>
+              </w:rPr>
+              <w:t xml:space="preserve">22.5</w:t>
+            </w:r>
+          </w:p>
+        </w:tc>
+        <w:tc>
+          <w:tcPr>
+            <w:tcW w:type="dxa" w:w="1272"/>
+            <w:tcBorders>
+              <w:top w:val="single" w:color="BFBFBF" w:sz="4"/>
+              <w:left w:val="single" w:color="BFBFBF" w:sz="4"/>
+              <w:bottom w:val="single" w:color="BFBFBF" w:sz="4"/>
+              <w:right w:val="single" w:color="BFBFBF" w:sz="4"/>
+            </w:tcBorders>
+            <w:tcMar>
+              <w:top w:type="dxa" w:w="40"/>
+              <w:left w:type="dxa" w:w="80"/>
+              <w:bottom w:type="dxa" w:w="40"/>
+              <w:right w:type="dxa" w:w="80"/>
+            </w:tcMar>
+          </w:tcPr>
+          <w:p>
+            <w:pPr>
+              <w:jc w:val="right"/>
+            </w:pPr>
+            <w:r>
+              <w:rPr>
+                <w:sz w:val="18"/>
+                <w:szCs w:val="18"/>
+              </w:rPr>
+              <w:t xml:space="preserve">1.76</w:t>
+            </w:r>
+          </w:p>
+        </w:tc>
+        <w:tc>
+          <w:tcPr>
+            <w:tcW w:type="dxa" w:w="1272"/>
+            <w:tcBorders>
+              <w:top w:val="single" w:color="BFBFBF" w:sz="4"/>
+              <w:left w:val="single" w:color="BFBFBF" w:sz="4"/>
+              <w:bottom w:val="single" w:color="BFBFBF" w:sz="4"/>
+              <w:right w:val="single" w:color="BFBFBF" w:sz="4"/>
+            </w:tcBorders>
+            <w:tcMar>
+              <w:top w:type="dxa" w:w="40"/>
+              <w:left w:type="dxa" w:w="80"/>
+              <w:bottom w:type="dxa" w:w="40"/>
+              <w:right w:type="dxa" w:w="80"/>
+            </w:tcMar>
+          </w:tcPr>
+          <w:p>
+            <w:pPr>
+              <w:jc w:val="right"/>
+            </w:pPr>
+            <w:r>
+              <w:rPr>
+                <w:sz w:val="18"/>
+                <w:szCs w:val="18"/>
+              </w:rPr>
+              <w:t xml:space="preserve">52%</w:t>
+            </w:r>
+          </w:p>
+        </w:tc>
+        <w:tc>
+          <w:tcPr>
+            <w:tcW w:type="dxa" w:w="1272"/>
+            <w:tcBorders>
+              <w:top w:val="single" w:color="BFBFBF" w:sz="4"/>
+              <w:left w:val="single" w:color="BFBFBF" w:sz="4"/>
+              <w:bottom w:val="single" w:color="BFBFBF" w:sz="4"/>
+              <w:right w:val="single" w:color="BFBFBF" w:sz="4"/>
+            </w:tcBorders>
+            <w:tcMar>
+              <w:top w:type="dxa" w:w="40"/>
+              <w:left w:type="dxa" w:w="80"/>
+              <w:bottom w:type="dxa" w:w="40"/>
+              <w:right w:type="dxa" w:w="80"/>
+            </w:tcMar>
+          </w:tcPr>
+          <w:p>
+            <w:pPr>
+              <w:jc w:val="right"/>
+            </w:pPr>
+            <w:r>
+              <w:rPr>
+                <w:sz w:val="18"/>
+                <w:szCs w:val="18"/>
+              </w:rPr>
+              <w:t xml:space="preserve">12.8</w:t>
+            </w:r>
+          </w:p>
+        </w:tc>
+        <w:tc>
+          <w:tcPr>
+            <w:tcW w:type="dxa" w:w="1272"/>
+            <w:tcBorders>
+              <w:top w:val="single" w:color="BFBFBF" w:sz="4"/>
+              <w:left w:val="single" w:color="BFBFBF" w:sz="4"/>
+              <w:bottom w:val="single" w:color="BFBFBF" w:sz="4"/>
+              <w:right w:val="single" w:color="BFBFBF" w:sz="4"/>
+            </w:tcBorders>
+            <w:tcMar>
+              <w:top w:type="dxa" w:w="40"/>
+              <w:left w:type="dxa" w:w="80"/>
+              <w:bottom w:type="dxa" w:w="40"/>
+              <w:right w:type="dxa" w:w="80"/>
+            </w:tcMar>
+          </w:tcPr>
+          <w:p>
+            <w:pPr>
+              <w:jc w:val="right"/>
+            </w:pPr>
+            <w:r>
+              <w:rPr>
+                <w:sz w:val="18"/>
+                <w:szCs w:val="18"/>
+              </w:rPr>
+              <w:t xml:space="preserve">445</w:t>
+            </w:r>
+          </w:p>
+        </w:tc>
+        <w:tc>
+          <w:tcPr>
+            <w:tcW w:type="dxa" w:w="1273"/>
+            <w:tcBorders>
+              <w:top w:val="single" w:color="BFBFBF" w:sz="4"/>
+              <w:left w:val="single" w:color="BFBFBF" w:sz="4"/>
+              <w:bottom w:val="single" w:color="BFBFBF" w:sz="4"/>
+              <w:right w:val="single" w:color="BFBFBF" w:sz="4"/>
+            </w:tcBorders>
+            <w:tcMar>
+              <w:top w:type="dxa" w:w="40"/>
+              <w:left w:type="dxa" w:w="80"/>
+              <w:bottom w:type="dxa" w:w="40"/>
+              <w:right w:type="dxa" w:w="80"/>
+            </w:tcMar>
+          </w:tcPr>
+          <w:p>
+            <w:pPr>
+              <w:jc w:val="right"/>
+            </w:pPr>
+            <w:r>
+              <w:rPr>
+                <w:sz w:val="18"/>
+                <w:szCs w:val="18"/>
+              </w:rPr>
+              <w:t xml:space="preserve">253</w:t>
+            </w:r>
+          </w:p>
+        </w:tc>
+      </w:tr>
+      <w:tr>
+        <w:trPr>
+          <w:tblHeader w:val="off"/>
+        </w:trPr>
+        <w:tc>
+          <w:tcPr>
+            <w:tcW w:type="dxa" w:w="1349"/>
+            <w:tcBorders>
+              <w:top w:val="single" w:color="BFBFBF" w:sz="4"/>
+              <w:left w:val="single" w:color="BFBFBF" w:sz="4"/>
+              <w:bottom w:val="single" w:color="BFBFBF" w:sz="4"/>
+              <w:right w:val="single" w:color="BFBFBF" w:sz="4"/>
+            </w:tcBorders>
+            <w:tcMar>
+              <w:top w:type="dxa" w:w="40"/>
+              <w:left w:type="dxa" w:w="80"/>
+              <w:bottom w:type="dxa" w:w="40"/>
+              <w:right w:type="dxa" w:w="80"/>
+            </w:tcMar>
+          </w:tcPr>
+          <w:p>
+            <w:pPr>
+              <w:jc w:val="left"/>
+            </w:pPr>
+            <w:r>
+              <w:rPr>
+                <w:sz w:val="18"/>
+                <w:szCs w:val="18"/>
+              </w:rPr>
+              <w:t xml:space="preserve">Sunshine West</w:t>
+            </w:r>
+          </w:p>
+        </w:tc>
+        <w:tc>
+          <w:tcPr>
+            <w:tcW w:type="dxa" w:w="1928"/>
+            <w:tcBorders>
+              <w:top w:val="single" w:color="BFBFBF" w:sz="4"/>
+              <w:left w:val="single" w:color="BFBFBF" w:sz="4"/>
+              <w:bottom w:val="single" w:color="BFBFBF" w:sz="4"/>
+              <w:right w:val="single" w:color="BFBFBF" w:sz="4"/>
+            </w:tcBorders>
+            <w:tcMar>
+              <w:top w:type="dxa" w:w="40"/>
+              <w:left w:type="dxa" w:w="80"/>
+              <w:bottom w:type="dxa" w:w="40"/>
+              <w:right w:type="dxa" w:w="80"/>
+            </w:tcMar>
+          </w:tcPr>
+          <w:p>
+            <w:pPr>
+              <w:jc w:val="left"/>
+            </w:pPr>
+            <w:r>
+              <w:rPr>
+                <w:sz w:val="18"/>
+                <w:szCs w:val="18"/>
+              </w:rPr>
+              <w:t xml:space="preserve">15.4</w:t>
+            </w:r>
+          </w:p>
+        </w:tc>
+        <w:tc>
+          <w:tcPr>
+            <w:tcW w:type="dxa" w:w="1272"/>
+            <w:tcBorders>
+              <w:top w:val="single" w:color="BFBFBF" w:sz="4"/>
+              <w:left w:val="single" w:color="BFBFBF" w:sz="4"/>
+              <w:bottom w:val="single" w:color="BFBFBF" w:sz="4"/>
+              <w:right w:val="single" w:color="BFBFBF" w:sz="4"/>
+            </w:tcBorders>
+            <w:tcMar>
+              <w:top w:type="dxa" w:w="40"/>
+              <w:left w:type="dxa" w:w="80"/>
+              <w:bottom w:type="dxa" w:w="40"/>
+              <w:right w:type="dxa" w:w="80"/>
+            </w:tcMar>
+          </w:tcPr>
+          <w:p>
+            <w:pPr>
+              <w:jc w:val="right"/>
+            </w:pPr>
+            <w:r>
+              <w:rPr>
+                <w:sz w:val="18"/>
+                <w:szCs w:val="18"/>
+              </w:rPr>
+              <w:t xml:space="preserve">1.48</w:t>
+            </w:r>
+          </w:p>
+        </w:tc>
+        <w:tc>
+          <w:tcPr>
+            <w:tcW w:type="dxa" w:w="1272"/>
+            <w:tcBorders>
+              <w:top w:val="single" w:color="BFBFBF" w:sz="4"/>
+              <w:left w:val="single" w:color="BFBFBF" w:sz="4"/>
+              <w:bottom w:val="single" w:color="BFBFBF" w:sz="4"/>
+              <w:right w:val="single" w:color="BFBFBF" w:sz="4"/>
+            </w:tcBorders>
+            <w:tcMar>
+              <w:top w:type="dxa" w:w="40"/>
+              <w:left w:type="dxa" w:w="80"/>
+              <w:bottom w:type="dxa" w:w="40"/>
+              <w:right w:type="dxa" w:w="80"/>
+            </w:tcMar>
+          </w:tcPr>
+          <w:p>
+            <w:pPr>
+              <w:jc w:val="right"/>
+            </w:pPr>
+            <w:r>
+              <w:rPr>
+                <w:sz w:val="18"/>
+                <w:szCs w:val="18"/>
+              </w:rPr>
+              <w:t xml:space="preserve">43%</w:t>
+            </w:r>
+          </w:p>
+        </w:tc>
+        <w:tc>
+          <w:tcPr>
+            <w:tcW w:type="dxa" w:w="1272"/>
+            <w:tcBorders>
+              <w:top w:val="single" w:color="BFBFBF" w:sz="4"/>
+              <w:left w:val="single" w:color="BFBFBF" w:sz="4"/>
+              <w:bottom w:val="single" w:color="BFBFBF" w:sz="4"/>
+              <w:right w:val="single" w:color="BFBFBF" w:sz="4"/>
+            </w:tcBorders>
+            <w:tcMar>
+              <w:top w:type="dxa" w:w="40"/>
+              <w:left w:type="dxa" w:w="80"/>
+              <w:bottom w:type="dxa" w:w="40"/>
+              <w:right w:type="dxa" w:w="80"/>
+            </w:tcMar>
+          </w:tcPr>
+          <w:p>
+            <w:pPr>
+              <w:jc w:val="right"/>
+            </w:pPr>
+            <w:r>
+              <w:rPr>
+                <w:sz w:val="18"/>
+                <w:szCs w:val="18"/>
+              </w:rPr>
+              <w:t xml:space="preserve">10.4</w:t>
+            </w:r>
+          </w:p>
+        </w:tc>
+        <w:tc>
+          <w:tcPr>
+            <w:tcW w:type="dxa" w:w="1272"/>
+            <w:tcBorders>
+              <w:top w:val="single" w:color="BFBFBF" w:sz="4"/>
+              <w:left w:val="single" w:color="BFBFBF" w:sz="4"/>
+              <w:bottom w:val="single" w:color="BFBFBF" w:sz="4"/>
+              <w:right w:val="single" w:color="BFBFBF" w:sz="4"/>
+            </w:tcBorders>
+            <w:tcMar>
+              <w:top w:type="dxa" w:w="40"/>
+              <w:left w:type="dxa" w:w="80"/>
+              <w:bottom w:type="dxa" w:w="40"/>
+              <w:right w:type="dxa" w:w="80"/>
+            </w:tcMar>
+          </w:tcPr>
+          <w:p>
+            <w:pPr>
+              <w:jc w:val="right"/>
+            </w:pPr>
+            <w:r>
+              <w:rPr>
+                <w:sz w:val="18"/>
+                <w:szCs w:val="18"/>
+              </w:rPr>
+              <w:t xml:space="preserve">500</w:t>
+            </w:r>
+          </w:p>
+        </w:tc>
+        <w:tc>
+          <w:tcPr>
+            <w:tcW w:type="dxa" w:w="1273"/>
+            <w:tcBorders>
+              <w:top w:val="single" w:color="BFBFBF" w:sz="4"/>
+              <w:left w:val="single" w:color="BFBFBF" w:sz="4"/>
+              <w:bottom w:val="single" w:color="BFBFBF" w:sz="4"/>
+              <w:right w:val="single" w:color="BFBFBF" w:sz="4"/>
+            </w:tcBorders>
+            <w:tcMar>
+              <w:top w:type="dxa" w:w="40"/>
+              <w:left w:type="dxa" w:w="80"/>
+              <w:bottom w:type="dxa" w:w="40"/>
+              <w:right w:type="dxa" w:w="80"/>
+            </w:tcMar>
+          </w:tcPr>
+          <w:p>
+            <w:pPr>
+              <w:jc w:val="right"/>
+            </w:pPr>
+            <w:r>
+              <w:rPr>
+                <w:sz w:val="18"/>
+                <w:szCs w:val="18"/>
+              </w:rPr>
+              <w:t xml:space="preserve">338</w:t>
+            </w:r>
+          </w:p>
+        </w:tc>
+      </w:tr>
+      <w:tr>
+        <w:trPr>
+          <w:tblHeader w:val="off"/>
+        </w:trPr>
+        <w:tc>
+          <w:tcPr>
+            <w:tcW w:type="dxa" w:w="1349"/>
+            <w:tcBorders>
+              <w:top w:val="single" w:color="BFBFBF" w:sz="4"/>
+              <w:left w:val="single" w:color="BFBFBF" w:sz="4"/>
+              <w:bottom w:val="single" w:color="BFBFBF" w:sz="4"/>
+              <w:right w:val="single" w:color="BFBFBF" w:sz="4"/>
+            </w:tcBorders>
+            <w:tcMar>
+              <w:top w:type="dxa" w:w="40"/>
+              <w:left w:type="dxa" w:w="80"/>
+              <w:bottom w:type="dxa" w:w="40"/>
+              <w:right w:type="dxa" w:w="80"/>
+            </w:tcMar>
+          </w:tcPr>
+          <w:p>
+            <w:pPr>
+              <w:jc w:val="left"/>
+            </w:pPr>
+            <w:r>
+              <w:rPr>
+                <w:b/>
+                <w:bCs/>
+                <w:sz w:val="18"/>
+                <w:szCs w:val="18"/>
+              </w:rPr>
+              <w:t xml:space="preserve">All red vans</w:t>
+            </w:r>
+          </w:p>
+        </w:tc>
+        <w:tc>
+          <w:tcPr>
+            <w:tcW w:type="dxa" w:w="1928"/>
+            <w:tcBorders>
+              <w:top w:val="single" w:color="BFBFBF" w:sz="4"/>
+              <w:left w:val="single" w:color="BFBFBF" w:sz="4"/>
+              <w:bottom w:val="single" w:color="BFBFBF" w:sz="4"/>
+              <w:right w:val="single" w:color="BFBFBF" w:sz="4"/>
+            </w:tcBorders>
+            <w:tcMar>
+              <w:top w:type="dxa" w:w="40"/>
+              <w:left w:type="dxa" w:w="80"/>
+              <w:bottom w:type="dxa" w:w="40"/>
+              <w:right w:type="dxa" w:w="80"/>
+            </w:tcMar>
+          </w:tcPr>
+          <w:p>
+            <w:pPr>
+              <w:jc w:val="left"/>
+            </w:pPr>
+            <w:r>
+              <w:rPr>
+                <w:sz w:val="18"/>
+                <w:szCs w:val="18"/>
+              </w:rPr>
+              <w:t xml:space="preserve">18.7</w:t>
+            </w:r>
+          </w:p>
+        </w:tc>
+        <w:tc>
+          <w:tcPr>
+            <w:tcW w:type="dxa" w:w="1272"/>
+            <w:tcBorders>
+              <w:top w:val="single" w:color="BFBFBF" w:sz="4"/>
+              <w:left w:val="single" w:color="BFBFBF" w:sz="4"/>
+              <w:bottom w:val="single" w:color="BFBFBF" w:sz="4"/>
+              <w:right w:val="single" w:color="BFBFBF" w:sz="4"/>
+            </w:tcBorders>
+            <w:tcMar>
+              <w:top w:type="dxa" w:w="40"/>
+              <w:left w:type="dxa" w:w="80"/>
+              <w:bottom w:type="dxa" w:w="40"/>
+              <w:right w:type="dxa" w:w="80"/>
+            </w:tcMar>
+          </w:tcPr>
+          <w:p>
+            <w:pPr>
+              <w:jc w:val="right"/>
+            </w:pPr>
+            <w:r>
+              <w:rPr>
+                <w:b/>
+                <w:bCs/>
+                <w:sz w:val="18"/>
+                <w:szCs w:val="18"/>
+              </w:rPr>
+              <w:t xml:space="preserve">1.57</w:t>
+            </w:r>
+          </w:p>
+        </w:tc>
+        <w:tc>
+          <w:tcPr>
+            <w:tcW w:type="dxa" w:w="1272"/>
+            <w:tcBorders>
+              <w:top w:val="single" w:color="BFBFBF" w:sz="4"/>
+              <w:left w:val="single" w:color="BFBFBF" w:sz="4"/>
+              <w:bottom w:val="single" w:color="BFBFBF" w:sz="4"/>
+              <w:right w:val="single" w:color="BFBFBF" w:sz="4"/>
+            </w:tcBorders>
+            <w:tcMar>
+              <w:top w:type="dxa" w:w="40"/>
+              <w:left w:type="dxa" w:w="80"/>
+              <w:bottom w:type="dxa" w:w="40"/>
+              <w:right w:type="dxa" w:w="80"/>
+            </w:tcMar>
+          </w:tcPr>
+          <w:p>
+            <w:pPr>
+              <w:jc w:val="right"/>
+            </w:pPr>
+            <w:r>
+              <w:rPr>
+                <w:sz w:val="18"/>
+                <w:szCs w:val="18"/>
+              </w:rPr>
+              <w:t xml:space="preserve">48%</w:t>
+            </w:r>
+          </w:p>
+        </w:tc>
+        <w:tc>
+          <w:tcPr>
+            <w:tcW w:type="dxa" w:w="1272"/>
+            <w:tcBorders>
+              <w:top w:val="single" w:color="BFBFBF" w:sz="4"/>
+              <w:left w:val="single" w:color="BFBFBF" w:sz="4"/>
+              <w:bottom w:val="single" w:color="BFBFBF" w:sz="4"/>
+              <w:right w:val="single" w:color="BFBFBF" w:sz="4"/>
+            </w:tcBorders>
+            <w:tcMar>
+              <w:top w:type="dxa" w:w="40"/>
+              <w:left w:type="dxa" w:w="80"/>
+              <w:bottom w:type="dxa" w:w="40"/>
+              <w:right w:type="dxa" w:w="80"/>
+            </w:tcMar>
+          </w:tcPr>
+          <w:p>
+            <w:pPr>
+              <w:jc w:val="right"/>
+            </w:pPr>
+            <w:r>
+              <w:rPr>
+                <w:b/>
+                <w:bCs/>
+                <w:sz w:val="18"/>
+                <w:szCs w:val="18"/>
+              </w:rPr>
+              <w:t xml:space="preserve">11.9</w:t>
+            </w:r>
+          </w:p>
+        </w:tc>
+        <w:tc>
+          <w:tcPr>
+            <w:tcW w:type="dxa" w:w="1272"/>
+            <w:tcBorders>
+              <w:top w:val="single" w:color="BFBFBF" w:sz="4"/>
+              <w:left w:val="single" w:color="BFBFBF" w:sz="4"/>
+              <w:bottom w:val="single" w:color="BFBFBF" w:sz="4"/>
+              <w:right w:val="single" w:color="BFBFBF" w:sz="4"/>
+            </w:tcBorders>
+            <w:tcMar>
+              <w:top w:type="dxa" w:w="40"/>
+              <w:left w:type="dxa" w:w="80"/>
+              <w:bottom w:type="dxa" w:w="40"/>
+              <w:right w:type="dxa" w:w="80"/>
+            </w:tcMar>
+          </w:tcPr>
+          <w:p>
+            <w:pPr>
+              <w:jc w:val="right"/>
+            </w:pPr>
+            <w:r>
+              <w:rPr>
+                <w:sz w:val="18"/>
+                <w:szCs w:val="18"/>
+              </w:rPr>
+              <w:t xml:space="preserve">453</w:t>
+            </w:r>
+          </w:p>
+        </w:tc>
+        <w:tc>
+          <w:tcPr>
+            <w:tcW w:type="dxa" w:w="1273"/>
+            <w:tcBorders>
+              <w:top w:val="single" w:color="BFBFBF" w:sz="4"/>
+              <w:left w:val="single" w:color="BFBFBF" w:sz="4"/>
+              <w:bottom w:val="single" w:color="BFBFBF" w:sz="4"/>
+              <w:right w:val="single" w:color="BFBFBF" w:sz="4"/>
+            </w:tcBorders>
+            <w:tcMar>
+              <w:top w:type="dxa" w:w="40"/>
+              <w:left w:type="dxa" w:w="80"/>
+              <w:bottom w:type="dxa" w:w="40"/>
+              <w:right w:type="dxa" w:w="80"/>
+            </w:tcMar>
+          </w:tcPr>
+          <w:p>
+            <w:pPr>
+              <w:jc w:val="right"/>
+            </w:pPr>
+            <w:r>
+              <w:rPr>
+                <w:b/>
+                <w:bCs/>
+                <w:sz w:val="18"/>
+                <w:szCs w:val="18"/>
+              </w:rPr>
+              <w:t xml:space="preserve">290</w:t>
+            </w:r>
+          </w:p>
+        </w:tc>
+      </w:tr>
+    </w:tbl>
+    <w:p/>
+    <w:p>
+      <w:pPr>
+        <w:pStyle w:val="ListParagraph"/>
+        <w:numPr>
+          <w:ilvl w:val="0"/>
+          <w:numId w:val="2"/>
+        </w:numPr>
+      </w:pPr>
+      <w:r>
+        <w:rPr>
+          <w:b/>
+          <w:bCs/>
+        </w:rPr>
+        <w:t xml:space="preserve">For trip-based sizing, use 12 stops per round and 1.6 rounds per route</w:t>
+      </w:r>
+      <w:r>
+        <w:t xml:space="preserve"> (red vans). The per-route number stays 19 for sizing vans.</w:t>
+      </w:r>
+    </w:p>
+    <w:p>
+      <w:pPr>
+        <w:pStyle w:val="ListParagraph"/>
+        <w:numPr>
+          <w:ilvl w:val="0"/>
+          <w:numId w:val="2"/>
+        </w:numPr>
+      </w:pPr>
+      <w:r>
+        <w:rPr>
+          <w:b/>
+          <w:bCs/>
+        </w:rPr>
+        <w:t xml:space="preserve">Rounds are about the vehicle's load, not the fleet.</w:t>
+      </w:r>
+      <w:r>
+        <w:t xml:space="preserve"> They don't change how many vans are needed, only how much each trip carries: 290 EA per trip against 453 per day.</w:t>
+      </w:r>
+    </w:p>
+    <w:p>
+      <w:pPr>
+        <w:pStyle w:val="ListParagraph"/>
+        <w:numPr>
+          <w:ilvl w:val="0"/>
+          <w:numId w:val="2"/>
+        </w:numPr>
+      </w:pPr>
+      <w:r>
+        <w:rPr>
+          <w:b/>
+          <w:bCs/>
+        </w:rPr>
+        <w:t xml:space="preserve">Sunshine West's high volume per vehicle is mostly the single-number fleet.</w:t>
+      </w:r>
+    </w:p>
+    <w:p>
+      <w:pPr>
+        <w:pStyle w:val="ListParagraph"/>
+        <w:numPr>
+          <w:ilvl w:val="1"/>
+          <w:numId w:val="2"/>
+        </w:numPr>
+      </w:pPr>
+      <w:r>
+        <w:t xml:space="preserve">Dividing its 2,112 Monday stops by 19 gives 111 vans and 609 EA each.</w:t>
+      </w:r>
+    </w:p>
+    <w:p>
+      <w:pPr>
+        <w:pStyle w:val="ListParagraph"/>
+        <w:numPr>
+          <w:ilvl w:val="1"/>
+          <w:numId w:val="2"/>
+        </w:numPr>
+      </w:pPr>
+      <w:r>
+        <w:t xml:space="preserve">CCP shows 136 routes a day at 15.4 stops each, so it's 500 EA per vehicle, and 338 per round at 1.48 rounds.</w:t>
+      </w:r>
+    </w:p>
+    <w:p>
+      <w:pPr>
+        <w:pStyle w:val="ListParagraph"/>
+        <w:numPr>
+          <w:ilvl w:val="0"/>
+          <w:numId w:val="2"/>
+        </w:numPr>
+      </w:pPr>
+      <w:r>
+        <w:rPr>
+          <w:b/>
+          <w:bCs/>
+        </w:rPr>
+        <w:t xml:space="preserve">It is still the highest per trip, and still about 2× van capacity.</w:t>
+      </w:r>
+      <w:r>
+        <w:t xml:space="preserve"> The reason is volume per stop: 32.5 EA against 18–27 elsewhere. Part of Sunshine West's peak (96,849) is probably not van-collected (counter lodgement, business-hub drop-offs). </w:t>
+      </w:r>
+      <w:r>
+        <w:rPr>
+          <w:b/>
+          <w:bCs/>
+        </w:rPr>
+        <w:t xml:space="preserve">Needs ops confirmation.</w:t>
+      </w:r>
+    </w:p>
+    <w:p>
+      <w:pPr>
+        <w:pStyle w:val="ListParagraph"/>
+        <w:numPr>
+          <w:ilvl w:val="0"/>
+          <w:numId w:val="2"/>
+        </w:numPr>
+      </w:pPr>
+      <w:r>
+        <w:rPr>
+          <w:b/>
+          <w:bCs/>
+        </w:rPr>
+        <w:t xml:space="preserve">Vans unload at their own depot, not a hub.</w:t>
+      </w:r>
+      <w:r>
+        <w:t xml:space="preserve"> Sunshine West over the week: SWPDC 743 unloads, Tullamarine Parcel Facility 135, Sunshine West Van Operations 50, MPF none.</w:t>
+      </w:r>
+    </w:p>
+    <w:p>
+      <w:pPr>
+        <w:pStyle w:val="ListParagraph"/>
+        <w:numPr>
+          <w:ilvl w:val="0"/>
+          <w:numId w:val="2"/>
+        </w:numPr>
+      </w:pPr>
+      <w:r>
+        <w:rPr>
+          <w:b/>
+          <w:bCs/>
+        </w:rPr>
+        <w:t xml:space="preserve">Trucks are not comparable on rounds.</w:t>
+      </w:r>
+      <w:r>
+        <w:t xml:space="preserve"> They show 1.8 rounds per route at about 2 customer stops each, because a transport truck drops at our buildings as it goes (it runs as a service). The truck figure to use stays 3.4 stops per route.</w:t>
+      </w:r>
+    </w:p>
+    <w:p>
+      <w:pPr>
+        <w:pStyle w:val="ListParagraph"/>
+        <w:numPr>
+          <w:ilvl w:val="0"/>
+          <w:numId w:val="2"/>
+        </w:numPr>
+      </w:pPr>
+      <w:r>
+        <w:rPr>
+          <w:b/>
+          <w:bCs/>
+        </w:rPr>
+        <w:t xml:space="preserve">Caveat:</w:t>
+      </w:r>
+      <w:r>
+        <w:t xml:space="preserve"> 5–29% of red-van routes (17% at Sunshine West) have pickups after their last booked unload. They count as one final round. If some of those vans carry on to a second route instead, rounds are slightly understated.</w:t>
       </w:r>
     </w:p>
     <w:p>
@@ -4321,7 +5990,7 @@
         <w:pStyle w:val="Heading1"/>
       </w:pPr>
       <w:r>
-        <w:t xml:space="preserve">7. Known gaps</w:t>
+        <w:t xml:space="preserve">6. Known gaps</w:t>
       </w:r>
     </w:p>
     <w:p>

</xml_diff>